<commit_message>
Make Medium Word files follow Medium's formatting rules
Title and subtitle use Heading 1/2 (Medium's big T / small T); template
blocks become real flat lists with bold sentence-case labels instead of
ALL CAPS and fake bullets; every image gets alt text and an 'Image by
the author' caption; titles shortened to 46-56 characters; dividers and
the 'follow for more' request removed; the AI prompt is a quote. README
documents the rules and the three post-paste checks.

Co-Authored-By: Claude Opus 5.5 <noreply@anthropic.com>
Claude-Session: https://claude.ai/code/session_013C64pm8XF1oxDj4uMpEd4H
</commit_message>
<xml_diff>
--- a/content/publish/devto-post.docx
+++ b/content/publish/devto-post.docx
@@ -27,7 +27,7 @@
           <wp:inline distT="0" distB="0" distL="0" distR="0">
             <wp:extent cx="5943600" cy="2495550"/>
             <wp:effectExtent t="0" r="0" b="0" l="0"/>
-            <wp:docPr id="1" name="" descr="" title=""/>
+            <wp:docPr id="1" name="devto-cover.png" descr="" title=""/>
             <wp:cNvGraphicFramePr>
               <a:graphicFrameLocks xmlns:a="http://schemas.openxmlformats.org/drawingml/2006/main" noChangeAspect="1"/>
             </wp:cNvGraphicFramePr>
@@ -106,7 +106,7 @@
           <wp:inline distT="0" distB="0" distL="0" distR="0">
             <wp:extent cx="5943600" cy="3324225"/>
             <wp:effectExtent t="0" r="0" b="0" l="0"/>
-            <wp:docPr id="1" name="" descr="" title=""/>
+            <wp:docPr id="1" name="devto-notes-flow.png" descr="How meeting notes flow into the repo: standup, planning and retro notes in docs/meetings, design decisions in docs/adr" title="How meeting notes flow into the repo: standup, planning and retro notes in docs/meetings, design decisions in docs/adr"/>
             <wp:cNvGraphicFramePr>
               <a:graphicFrameLocks xmlns:a="http://schemas.openxmlformats.org/drawingml/2006/main" noChangeAspect="1"/>
             </wp:cNvGraphicFramePr>
@@ -2358,7 +2358,7 @@
       <w:r>
         <w:t xml:space="preserve">If your team records calls, you can generate a first draft of these notes from the transcript instead of typing them live. I wrote up </w:t>
       </w:r>
-      <w:hyperlink w:history="1" r:id="rIdtpdiur8w1zahqpthtj-28">
+      <w:hyperlink w:history="1" r:id="rIdezapxk-3w5pwasafti1is">
         <w:r>
           <w:rPr>
             <w:rStyle w:val="Hyperlink"/>

</xml_diff>